<commit_message>
Simplify Apps Script HTML to DOCX conversion
</commit_message>
<xml_diff>
--- a/Code.docx
+++ b/Code.docx
@@ -3,963 +3,205 @@
 <w:document xmlns:wpc="http://schemas.microsoft.com/office/word/2010/wordprocessingCanvas" xmlns:mo="http://schemas.microsoft.com/office/mac/office/2008/main" xmlns:mc="http://schemas.openxmlformats.org/markup-compatibility/2006" xmlns:mv="urn:schemas-microsoft-com:mac:vml" xmlns:o="urn:schemas-microsoft-com:office:office" xmlns:r="http://schemas.openxmlformats.org/officeDocument/2006/relationships" xmlns:m="http://schemas.openxmlformats.org/officeDocument/2006/math" xmlns:v="urn:schemas-microsoft-com:vml" xmlns:wp14="http://schemas.microsoft.com/office/word/2010/wordprocessingDrawing" xmlns:wp="http://schemas.openxmlformats.org/drawingml/2006/wordprocessingDrawing" xmlns:w10="urn:schemas-microsoft-com:office:word" xmlns:w="http://schemas.openxmlformats.org/wordprocessingml/2006/main" xmlns:w14="http://schemas.microsoft.com/office/word/2010/wordml" xmlns:wpg="http://schemas.microsoft.com/office/word/2010/wordprocessingGroup" xmlns:wpi="http://schemas.microsoft.com/office/word/2010/wordprocessingInk" xmlns:wne="http://schemas.microsoft.com/office/word/2006/wordml" xmlns:wps="http://schemas.microsoft.com/office/word/2010/wordprocessingShape" mc:Ignorable="w14 wp14">
   <w:body>
     <w:p>
-      <w:pPr>
-        <w:keepLines w:val="0"/>
-        <w:widowControl w:val="0"/>
-      </w:pPr>
+      <w:pPr/>
       <w:r>
-        <w:t>/**</w:t>
+        <w:t>// Google Apps ScriptでゲームHTMLをDOCXに変換して、Google Driveへ保存します。</w:t>
       </w:r>
     </w:p>
     <w:p>
-      <w:pPr>
-        <w:keepLines w:val="0"/>
-        <w:widowControl w:val="0"/>
-      </w:pPr>
-      <w:r>
-        <w:t xml:space="preserve"> * SPACE SUSPECT のHTMLソースをGoogleドライブ上のDOCXに変換します。</w:t>
-      </w:r>
-    </w:p>
-    <w:p>
-      <w:pPr>
-        <w:keepLines w:val="0"/>
-        <w:widowControl w:val="0"/>
-      </w:pPr>
-      <w:r>
-        <w:t xml:space="preserve"> * HTML全体を1つのGoogleドキュメントに入れると文字数上限を超えるため、</w:t>
-      </w:r>
-    </w:p>
-    <w:p>
-      <w:pPr>
-        <w:keepLines w:val="0"/>
-        <w:widowControl w:val="0"/>
-      </w:pPr>
-      <w:r>
-        <w:t xml:space="preserve"> * ファイルごとに行単位で分割し、複数のDOCXとして保存します。</w:t>
-      </w:r>
-    </w:p>
-    <w:p>
-      <w:pPr>
-        <w:keepLines w:val="0"/>
-        <w:widowControl w:val="0"/>
-      </w:pPr>
-      <w:r>
-        <w:t xml:space="preserve"> *</w:t>
-      </w:r>
-    </w:p>
-    <w:p>
-      <w:pPr>
-        <w:keepLines w:val="0"/>
-        <w:widowControl w:val="0"/>
-      </w:pPr>
-      <w:r>
-        <w:t xml:space="preserve"> * 実行方法:</w:t>
-      </w:r>
-    </w:p>
-    <w:p>
-      <w:pPr>
-        <w:keepLines w:val="0"/>
-        <w:widowControl w:val="0"/>
-      </w:pPr>
-      <w:r>
-        <w:t xml:space="preserve"> * 1. script.google.com で新しいプロジェクトを作成</w:t>
-      </w:r>
-    </w:p>
-    <w:p>
-      <w:pPr>
-        <w:keepLines w:val="0"/>
-        <w:widowControl w:val="0"/>
-      </w:pPr>
-      <w:r>
-        <w:t xml:space="preserve"> * 2. このファイルの内容を Code.gs に貼り付け</w:t>
-      </w:r>
-    </w:p>
-    <w:p>
-      <w:pPr>
-        <w:keepLines w:val="0"/>
-        <w:widowControl w:val="0"/>
-      </w:pPr>
-      <w:r>
-        <w:t xml:space="preserve"> * 3. exportGameHtmlToDocx を実行し、Googleドライブへのアクセスを許可</w:t>
-      </w:r>
-    </w:p>
-    <w:p>
-      <w:pPr>
-        <w:keepLines w:val="0"/>
-        <w:widowControl w:val="0"/>
-      </w:pPr>
-      <w:r>
-        <w:t xml:space="preserve"> * 4. 実行ログに表示されたフォルダURLを開く</w:t>
-      </w:r>
-    </w:p>
-    <w:p>
-      <w:pPr>
-        <w:keepLines w:val="0"/>
-        <w:widowControl w:val="0"/>
-      </w:pPr>
-      <w:r>
-        <w:t xml:space="preserve"> */</w:t>
-      </w:r>
-    </w:p>
-    <w:p>
-      <w:pPr>
-        <w:keepLines w:val="0"/>
-        <w:widowControl w:val="0"/>
-      </w:pPr>
-      <w:r/>
-    </w:p>
-    <w:p>
-      <w:pPr>
-        <w:keepLines w:val="0"/>
-        <w:widowControl w:val="0"/>
-      </w:pPr>
-      <w:r>
-        <w:t>var GAME_REPOSITORY = "jitianzheping19-del/suspect-space";</w:t>
-      </w:r>
-    </w:p>
-    <w:p>
-      <w:pPr>
-        <w:keepLines w:val="0"/>
-        <w:widowControl w:val="0"/>
-      </w:pPr>
-      <w:r>
-        <w:t>var GAME_BRANCH = "main";</w:t>
-      </w:r>
-    </w:p>
-    <w:p>
-      <w:pPr>
-        <w:keepLines w:val="0"/>
-        <w:widowControl w:val="0"/>
-      </w:pPr>
-      <w:r>
-        <w:t>var SOURCE_HTML_FILES = [</w:t>
-      </w:r>
-    </w:p>
-    <w:p>
-      <w:pPr>
-        <w:keepLines w:val="0"/>
-        <w:widowControl w:val="0"/>
-      </w:pPr>
-      <w:r>
-        <w:t xml:space="preserve">  "space-suspect-complete.html",</w:t>
-      </w:r>
-    </w:p>
-    <w:p>
-      <w:pPr>
-        <w:keepLines w:val="0"/>
-        <w:widowControl w:val="0"/>
-      </w:pPr>
-      <w:r>
-        <w:t xml:space="preserve">  "index.html",</w:t>
-      </w:r>
-    </w:p>
-    <w:p>
-      <w:pPr>
-        <w:keepLines w:val="0"/>
-        <w:widowControl w:val="0"/>
-      </w:pPr>
-      <w:r>
-        <w:t xml:space="preserve">  "space-suspect-final.html"</w:t>
-      </w:r>
-    </w:p>
-    <w:p>
-      <w:pPr>
-        <w:keepLines w:val="0"/>
-        <w:widowControl w:val="0"/>
-      </w:pPr>
-      <w:r>
-        <w:t>];</w:t>
-      </w:r>
-    </w:p>
-    <w:p>
-      <w:pPr>
-        <w:keepLines w:val="0"/>
-        <w:widowControl w:val="0"/>
-      </w:pPr>
-      <w:r/>
-    </w:p>
-    <w:p>
-      <w:pPr>
-        <w:keepLines w:val="0"/>
-        <w:widowControl w:val="0"/>
-      </w:pPr>
-      <w:r>
-        <w:t>// Googleドキュメントの文字数上限より余裕を持たせて分割します。</w:t>
-      </w:r>
-    </w:p>
-    <w:p>
-      <w:pPr>
-        <w:keepLines w:val="0"/>
-        <w:widowControl w:val="0"/>
-      </w:pPr>
-      <w:r>
-        <w:t>var MAX_CHARS_PER_DOCX = 800000;</w:t>
-      </w:r>
-    </w:p>
-    <w:p>
-      <w:pPr>
-        <w:keepLines w:val="0"/>
-        <w:widowControl w:val="0"/>
-      </w:pPr>
-      <w:r>
-        <w:t>var WORD_MIME_TYPE = "application/vnd.openxmlformats-officedocument.wordprocessingml.document";</w:t>
-      </w:r>
-    </w:p>
-    <w:p>
-      <w:pPr>
-        <w:keepLines w:val="0"/>
-        <w:widowControl w:val="0"/>
-      </w:pPr>
-      <w:r/>
-    </w:p>
-    <w:p>
-      <w:pPr>
-        <w:keepLines w:val="0"/>
-        <w:widowControl w:val="0"/>
-      </w:pPr>
+      <w:pPr/>
       <w:r>
         <w:t>function exportGameHtmlToDocx() {</w:t>
       </w:r>
     </w:p>
     <w:p>
-      <w:pPr>
-        <w:keepLines w:val="0"/>
-        <w:widowControl w:val="0"/>
-      </w:pPr>
+      <w:pPr/>
       <w:r>
-        <w:t xml:space="preserve">  var stamp = Utilities.formatDate(new Date(), Session.getScriptTimeZone(), "yyyyMMdd-HHmmss");</w:t>
+        <w:t xml:space="preserve">  var url = "https://raw.githubusercontent.com/jitianzheping19-del/suspect-space/main/space-suspect-complete.html";</w:t>
       </w:r>
     </w:p>
     <w:p>
-      <w:pPr>
-        <w:keepLines w:val="0"/>
-        <w:widowControl w:val="0"/>
-      </w:pPr>
+      <w:pPr/>
       <w:r>
-        <w:t xml:space="preserve">  var folder = DriveApp.createFolder("SPACE SUSPECT HTML DOCX " + stamp);</w:t>
+        <w:t xml:space="preserve">  var html = UrlFetchApp.fetch(url).getContentText("UTF-8");</w:t>
       </w:r>
     </w:p>
     <w:p>
-      <w:pPr>
-        <w:keepLines w:val="0"/>
-        <w:widowControl w:val="0"/>
-      </w:pPr>
+      <w:pPr/>
       <w:r>
-        <w:t xml:space="preserve">  var createdFiles = [];</w:t>
+        <w:t xml:space="preserve">  var folder = DriveApp.createFolder("SPACE SUSPECT DOCX");</w:t>
       </w:r>
     </w:p>
     <w:p>
-      <w:pPr>
-        <w:keepLines w:val="0"/>
-        <w:widowControl w:val="0"/>
-      </w:pPr>
-      <w:r/>
-    </w:p>
-    <w:p>
-      <w:pPr>
-        <w:keepLines w:val="0"/>
-        <w:widowControl w:val="0"/>
-      </w:pPr>
+      <w:pPr/>
       <w:r>
-        <w:t xml:space="preserve">  SOURCE_HTML_FILES.forEach(function (fileName) {</w:t>
+        <w:t xml:space="preserve">  var parts = splitHtml_(html, 800000);</w:t>
       </w:r>
     </w:p>
     <w:p>
-      <w:pPr>
-        <w:keepLines w:val="0"/>
-        <w:widowControl w:val="0"/>
-      </w:pPr>
+      <w:pPr/>
+    </w:p>
+    <w:p>
+      <w:pPr/>
       <w:r>
-        <w:t xml:space="preserve">    var source = fetchGameHtml_(fileName);</w:t>
+        <w:t xml:space="preserve">  parts.forEach(function (text, i) {</w:t>
       </w:r>
     </w:p>
     <w:p>
-      <w:pPr>
-        <w:keepLines w:val="0"/>
-        <w:widowControl w:val="0"/>
-      </w:pPr>
+      <w:pPr/>
       <w:r>
-        <w:t xml:space="preserve">    var chunks = splitSourceByLines_(source, MAX_CHARS_PER_DOCX);</w:t>
+        <w:t xml:space="preserve">    var doc = DocumentApp.create("SPACE SUSPECT HTML " + (i + 1));</w:t>
       </w:r>
     </w:p>
     <w:p>
-      <w:pPr>
-        <w:keepLines w:val="0"/>
-        <w:widowControl w:val="0"/>
-      </w:pPr>
-      <w:r/>
-    </w:p>
-    <w:p>
-      <w:pPr>
-        <w:keepLines w:val="0"/>
-        <w:widowControl w:val="0"/>
-      </w:pPr>
+      <w:pPr/>
       <w:r>
-        <w:t xml:space="preserve">    chunks.forEach(function (chunk, index) {</w:t>
+        <w:t xml:space="preserve">    var body = doc.getBody();</w:t>
       </w:r>
     </w:p>
     <w:p>
-      <w:pPr>
-        <w:keepLines w:val="0"/>
-        <w:widowControl w:val="0"/>
-      </w:pPr>
+      <w:pPr/>
       <w:r>
-        <w:t xml:space="preserve">      var part = index + 1;</w:t>
+        <w:t xml:space="preserve">    body.setText(text);</w:t>
       </w:r>
     </w:p>
     <w:p>
-      <w:pPr>
-        <w:keepLines w:val="0"/>
-        <w:widowControl w:val="0"/>
-      </w:pPr>
+      <w:pPr/>
       <w:r>
-        <w:t xml:space="preserve">      var title = fileName + " " + part + "-" + chunks.length;</w:t>
+        <w:t xml:space="preserve">    body.editAsText().setFontFamily("Courier New").setFontSize(7);</w:t>
       </w:r>
     </w:p>
     <w:p>
-      <w:pPr>
-        <w:keepLines w:val="0"/>
-        <w:widowControl w:val="0"/>
-      </w:pPr>
+      <w:pPr/>
       <w:r>
-        <w:t xml:space="preserve">      var tempDoc = DocumentApp.create(title);</w:t>
+        <w:t xml:space="preserve">    doc.saveAndClose();</w:t>
       </w:r>
     </w:p>
     <w:p>
-      <w:pPr>
-        <w:keepLines w:val="0"/>
-        <w:widowControl w:val="0"/>
-      </w:pPr>
+      <w:pPr/>
+    </w:p>
+    <w:p>
+      <w:pPr/>
       <w:r>
-        <w:t xml:space="preserve">      var body = tempDoc.getBody();</w:t>
+        <w:t xml:space="preserve">    var name = "space-suspect-complete-" + (i + 1) + ".docx";</w:t>
       </w:r>
     </w:p>
     <w:p>
-      <w:pPr>
-        <w:keepLines w:val="0"/>
-        <w:widowControl w:val="0"/>
-      </w:pPr>
+      <w:pPr/>
       <w:r>
-        <w:t xml:space="preserve">      body.setText(</w:t>
+        <w:t xml:space="preserve">    var blob = DriveApp.getFileById(doc.getId())</w:t>
       </w:r>
     </w:p>
     <w:p>
-      <w:pPr>
-        <w:keepLines w:val="0"/>
-        <w:widowControl w:val="0"/>
-      </w:pPr>
+      <w:pPr/>
       <w:r>
-        <w:t xml:space="preserve">        "SPACE SUSPECT HTMLソース\n" +</w:t>
+        <w:t xml:space="preserve">      .getAs("application/vnd.openxmlformats-officedocument.wordprocessingml.document")</w:t>
       </w:r>
     </w:p>
     <w:p>
-      <w:pPr>
-        <w:keepLines w:val="0"/>
-        <w:widowControl w:val="0"/>
-      </w:pPr>
+      <w:pPr/>
       <w:r>
-        <w:t xml:space="preserve">        "元ファイル: " + fileName + "\n" +</w:t>
+        <w:t xml:space="preserve">      .setName(name);</w:t>
       </w:r>
     </w:p>
     <w:p>
-      <w:pPr>
-        <w:keepLines w:val="0"/>
-        <w:widowControl w:val="0"/>
-      </w:pPr>
+      <w:pPr/>
       <w:r>
-        <w:t xml:space="preserve">        "分割: " + part + " / " + chunks.length + "\n\n" +</w:t>
+        <w:t xml:space="preserve">    folder.createFile(blob);</w:t>
       </w:r>
     </w:p>
     <w:p>
-      <w:pPr>
-        <w:keepLines w:val="0"/>
-        <w:widowControl w:val="0"/>
-      </w:pPr>
+      <w:pPr/>
       <w:r>
-        <w:t xml:space="preserve">        chunk</w:t>
+        <w:t xml:space="preserve">    DriveApp.getFileById(doc.getId()).setTrashed(true);</w:t>
       </w:r>
     </w:p>
     <w:p>
-      <w:pPr>
-        <w:keepLines w:val="0"/>
-        <w:widowControl w:val="0"/>
-      </w:pPr>
-      <w:r>
-        <w:t xml:space="preserve">      );</w:t>
-      </w:r>
-    </w:p>
-    <w:p>
-      <w:pPr>
-        <w:keepLines w:val="0"/>
-        <w:widowControl w:val="0"/>
-      </w:pPr>
-      <w:r>
-        <w:t xml:space="preserve">      body.editAsText().setFontFamily("Courier New").setFontSize(7);</w:t>
-      </w:r>
-    </w:p>
-    <w:p>
-      <w:pPr>
-        <w:keepLines w:val="0"/>
-        <w:widowControl w:val="0"/>
-      </w:pPr>
-      <w:r>
-        <w:t xml:space="preserve">      tempDoc.saveAndClose();</w:t>
-      </w:r>
-    </w:p>
-    <w:p>
-      <w:pPr>
-        <w:keepLines w:val="0"/>
-        <w:widowControl w:val="0"/>
-      </w:pPr>
-      <w:r/>
-    </w:p>
-    <w:p>
-      <w:pPr>
-        <w:keepLines w:val="0"/>
-        <w:widowControl w:val="0"/>
-      </w:pPr>
-      <w:r>
-        <w:t xml:space="preserve">      var docxName = fileName.replace(/\.html$/i, "") + "-" +</w:t>
-      </w:r>
-    </w:p>
-    <w:p>
-      <w:pPr>
-        <w:keepLines w:val="0"/>
-        <w:widowControl w:val="0"/>
-      </w:pPr>
-      <w:r>
-        <w:t xml:space="preserve">        String(part).padStart(2, "0") + "-of-" +</w:t>
-      </w:r>
-    </w:p>
-    <w:p>
-      <w:pPr>
-        <w:keepLines w:val="0"/>
-        <w:widowControl w:val="0"/>
-      </w:pPr>
-      <w:r>
-        <w:t xml:space="preserve">        String(chunks.length).padStart(2, "0") + ".docx";</w:t>
-      </w:r>
-    </w:p>
-    <w:p>
-      <w:pPr>
-        <w:keepLines w:val="0"/>
-        <w:widowControl w:val="0"/>
-      </w:pPr>
-      <w:r>
-        <w:t xml:space="preserve">      var blob = DriveApp.getFileById(tempDoc.getId())</w:t>
-      </w:r>
-    </w:p>
-    <w:p>
-      <w:pPr>
-        <w:keepLines w:val="0"/>
-        <w:widowControl w:val="0"/>
-      </w:pPr>
-      <w:r>
-        <w:t xml:space="preserve">        .getAs(WORD_MIME_TYPE)</w:t>
-      </w:r>
-    </w:p>
-    <w:p>
-      <w:pPr>
-        <w:keepLines w:val="0"/>
-        <w:widowControl w:val="0"/>
-      </w:pPr>
-      <w:r>
-        <w:t xml:space="preserve">        .setName(docxName);</w:t>
-      </w:r>
-    </w:p>
-    <w:p>
-      <w:pPr>
-        <w:keepLines w:val="0"/>
-        <w:widowControl w:val="0"/>
-      </w:pPr>
-      <w:r>
-        <w:t xml:space="preserve">      var outputFile = folder.createFile(blob);</w:t>
-      </w:r>
-    </w:p>
-    <w:p>
-      <w:pPr>
-        <w:keepLines w:val="0"/>
-        <w:widowControl w:val="0"/>
-      </w:pPr>
-      <w:r>
-        <w:t xml:space="preserve">      createdFiles.push({ name: docxName, url: outputFile.getUrl() });</w:t>
-      </w:r>
-    </w:p>
-    <w:p>
-      <w:pPr>
-        <w:keepLines w:val="0"/>
-        <w:widowControl w:val="0"/>
-      </w:pPr>
-      <w:r/>
-    </w:p>
-    <w:p>
-      <w:pPr>
-        <w:keepLines w:val="0"/>
-        <w:widowControl w:val="0"/>
-      </w:pPr>
-      <w:r>
-        <w:t xml:space="preserve">      // DOCXを書き出した後、変換用のGoogleドキュメントは片付けます。</w:t>
-      </w:r>
-    </w:p>
-    <w:p>
-      <w:pPr>
-        <w:keepLines w:val="0"/>
-        <w:widowControl w:val="0"/>
-      </w:pPr>
-      <w:r>
-        <w:t xml:space="preserve">      DriveApp.getFileById(tempDoc.getId()).setTrashed(true);</w:t>
-      </w:r>
-    </w:p>
-    <w:p>
-      <w:pPr>
-        <w:keepLines w:val="0"/>
-        <w:widowControl w:val="0"/>
-      </w:pPr>
-      <w:r>
-        <w:t xml:space="preserve">    });</w:t>
-      </w:r>
-    </w:p>
-    <w:p>
-      <w:pPr>
-        <w:keepLines w:val="0"/>
-        <w:widowControl w:val="0"/>
-      </w:pPr>
+      <w:pPr/>
       <w:r>
         <w:t xml:space="preserve">  });</w:t>
       </w:r>
     </w:p>
     <w:p>
-      <w:pPr>
-        <w:keepLines w:val="0"/>
-        <w:widowControl w:val="0"/>
-      </w:pPr>
-      <w:r/>
+      <w:pPr/>
     </w:p>
     <w:p>
-      <w:pPr>
-        <w:keepLines w:val="0"/>
-        <w:widowControl w:val="0"/>
-      </w:pPr>
+      <w:pPr/>
       <w:r>
-        <w:t xml:space="preserve">  console.log("DOCX保存先: " + folder.getUrl());</w:t>
+        <w:t xml:space="preserve">  Logger.log("作成したDOCX: " + folder.getUrl());</w:t>
       </w:r>
     </w:p>
     <w:p>
-      <w:pPr>
-        <w:keepLines w:val="0"/>
-        <w:widowControl w:val="0"/>
-      </w:pPr>
-      <w:r>
-        <w:t xml:space="preserve">  createdFiles.forEach(function (file) {</w:t>
-      </w:r>
-    </w:p>
-    <w:p>
-      <w:pPr>
-        <w:keepLines w:val="0"/>
-        <w:widowControl w:val="0"/>
-      </w:pPr>
-      <w:r>
-        <w:t xml:space="preserve">    console.log(file.name + "  " + file.url);</w:t>
-      </w:r>
-    </w:p>
-    <w:p>
-      <w:pPr>
-        <w:keepLines w:val="0"/>
-        <w:widowControl w:val="0"/>
-      </w:pPr>
-      <w:r>
-        <w:t xml:space="preserve">  });</w:t>
-      </w:r>
-    </w:p>
-    <w:p>
-      <w:pPr>
-        <w:keepLines w:val="0"/>
-        <w:widowControl w:val="0"/>
-      </w:pPr>
-      <w:r>
-        <w:t xml:space="preserve">  return folder.getUrl();</w:t>
-      </w:r>
-    </w:p>
-    <w:p>
-      <w:pPr>
-        <w:keepLines w:val="0"/>
-        <w:widowControl w:val="0"/>
-      </w:pPr>
+      <w:pPr/>
       <w:r>
         <w:t>}</w:t>
       </w:r>
     </w:p>
     <w:p>
-      <w:pPr>
-        <w:keepLines w:val="0"/>
-        <w:widowControl w:val="0"/>
-      </w:pPr>
-      <w:r/>
+      <w:pPr/>
     </w:p>
     <w:p>
-      <w:pPr>
-        <w:keepLines w:val="0"/>
-        <w:widowControl w:val="0"/>
-      </w:pPr>
+      <w:pPr/>
       <w:r>
-        <w:t>function fetchGameHtml_(fileName) {</w:t>
+        <w:t>function splitHtml_(text, limit) {</w:t>
       </w:r>
     </w:p>
     <w:p>
-      <w:pPr>
-        <w:keepLines w:val="0"/>
-        <w:widowControl w:val="0"/>
-      </w:pPr>
+      <w:pPr/>
       <w:r>
-        <w:t xml:space="preserve">  var url = "https://raw.githubusercontent.com/" + GAME_REPOSITORY + "/" +</w:t>
+        <w:t xml:space="preserve">  var parts = [];</w:t>
       </w:r>
     </w:p>
     <w:p>
-      <w:pPr>
-        <w:keepLines w:val="0"/>
-        <w:widowControl w:val="0"/>
-      </w:pPr>
+      <w:pPr/>
       <w:r>
-        <w:t xml:space="preserve">    GAME_BRANCH + "/" + encodeURIComponent(fileName);</w:t>
+        <w:t xml:space="preserve">  while (text.length &gt; limit) {</w:t>
       </w:r>
     </w:p>
     <w:p>
-      <w:pPr>
-        <w:keepLines w:val="0"/>
-        <w:widowControl w:val="0"/>
-      </w:pPr>
+      <w:pPr/>
       <w:r>
-        <w:t xml:space="preserve">  var response = UrlFetchApp.fetch(url, { muteHttpExceptions: true });</w:t>
+        <w:t xml:space="preserve">    var cut = text.lastIndexOf("\n", limit);</w:t>
       </w:r>
     </w:p>
     <w:p>
-      <w:pPr>
-        <w:keepLines w:val="0"/>
-        <w:widowControl w:val="0"/>
-      </w:pPr>
+      <w:pPr/>
       <w:r>
-        <w:t xml:space="preserve">  if (response.getResponseCode() !== 200) {</w:t>
+        <w:t xml:space="preserve">    if (cut &lt; 1) cut = limit;</w:t>
       </w:r>
     </w:p>
     <w:p>
-      <w:pPr>
-        <w:keepLines w:val="0"/>
-        <w:widowControl w:val="0"/>
-      </w:pPr>
+      <w:pPr/>
       <w:r>
-        <w:t xml:space="preserve">    throw new Error(fileName + " の取得に失敗しました (HTTP " +</w:t>
+        <w:t xml:space="preserve">    parts.push(text.slice(0, cut + 1));</w:t>
       </w:r>
     </w:p>
     <w:p>
-      <w:pPr>
-        <w:keepLines w:val="0"/>
-        <w:widowControl w:val="0"/>
-      </w:pPr>
+      <w:pPr/>
       <w:r>
-        <w:t xml:space="preserve">      response.getResponseCode() + ")");</w:t>
+        <w:t xml:space="preserve">    text = text.slice(cut + 1);</w:t>
       </w:r>
     </w:p>
     <w:p>
-      <w:pPr>
-        <w:keepLines w:val="0"/>
-        <w:widowControl w:val="0"/>
-      </w:pPr>
+      <w:pPr/>
       <w:r>
         <w:t xml:space="preserve">  }</w:t>
       </w:r>
     </w:p>
     <w:p>
-      <w:pPr>
-        <w:keepLines w:val="0"/>
-        <w:widowControl w:val="0"/>
-      </w:pPr>
+      <w:pPr/>
       <w:r>
-        <w:t xml:space="preserve">  return response.getContentText("UTF-8");</w:t>
+        <w:t xml:space="preserve">  parts.push(text);</w:t>
       </w:r>
     </w:p>
     <w:p>
-      <w:pPr>
-        <w:keepLines w:val="0"/>
-        <w:widowControl w:val="0"/>
-      </w:pPr>
+      <w:pPr/>
       <w:r>
-        <w:t>}</w:t>
+        <w:t xml:space="preserve">  return parts;</w:t>
       </w:r>
     </w:p>
     <w:p>
-      <w:pPr>
-        <w:keepLines w:val="0"/>
-        <w:widowControl w:val="0"/>
-      </w:pPr>
-      <w:r/>
-    </w:p>
-    <w:p>
-      <w:pPr>
-        <w:keepLines w:val="0"/>
-        <w:widowControl w:val="0"/>
-      </w:pPr>
-      <w:r>
-        <w:t>function splitSourceByLines_(source, maxChars) {</w:t>
-      </w:r>
-    </w:p>
-    <w:p>
-      <w:pPr>
-        <w:keepLines w:val="0"/>
-        <w:widowControl w:val="0"/>
-      </w:pPr>
-      <w:r>
-        <w:t xml:space="preserve">  var lines = source.split("\n");</w:t>
-      </w:r>
-    </w:p>
-    <w:p>
-      <w:pPr>
-        <w:keepLines w:val="0"/>
-        <w:widowControl w:val="0"/>
-      </w:pPr>
-      <w:r>
-        <w:t xml:space="preserve">  var chunks = [];</w:t>
-      </w:r>
-    </w:p>
-    <w:p>
-      <w:pPr>
-        <w:keepLines w:val="0"/>
-        <w:widowControl w:val="0"/>
-      </w:pPr>
-      <w:r>
-        <w:t xml:space="preserve">  var currentLines = [];</w:t>
-      </w:r>
-    </w:p>
-    <w:p>
-      <w:pPr>
-        <w:keepLines w:val="0"/>
-        <w:widowControl w:val="0"/>
-      </w:pPr>
-      <w:r>
-        <w:t xml:space="preserve">  var currentLength = 0;</w:t>
-      </w:r>
-    </w:p>
-    <w:p>
-      <w:pPr>
-        <w:keepLines w:val="0"/>
-        <w:widowControl w:val="0"/>
-      </w:pPr>
-      <w:r/>
-    </w:p>
-    <w:p>
-      <w:pPr>
-        <w:keepLines w:val="0"/>
-        <w:widowControl w:val="0"/>
-      </w:pPr>
-      <w:r>
-        <w:t xml:space="preserve">  lines.forEach(function (line) {</w:t>
-      </w:r>
-    </w:p>
-    <w:p>
-      <w:pPr>
-        <w:keepLines w:val="0"/>
-        <w:widowControl w:val="0"/>
-      </w:pPr>
-      <w:r>
-        <w:t xml:space="preserve">    var piece = line + "\n";</w:t>
-      </w:r>
-    </w:p>
-    <w:p>
-      <w:pPr>
-        <w:keepLines w:val="0"/>
-        <w:widowControl w:val="0"/>
-      </w:pPr>
-      <w:r>
-        <w:t xml:space="preserve">    if (currentLength &gt; 0 &amp;&amp; currentLength + piece.length &gt; maxChars) {</w:t>
-      </w:r>
-    </w:p>
-    <w:p>
-      <w:pPr>
-        <w:keepLines w:val="0"/>
-        <w:widowControl w:val="0"/>
-      </w:pPr>
-      <w:r>
-        <w:t xml:space="preserve">      chunks.push(currentLines.join(""));</w:t>
-      </w:r>
-    </w:p>
-    <w:p>
-      <w:pPr>
-        <w:keepLines w:val="0"/>
-        <w:widowControl w:val="0"/>
-      </w:pPr>
-      <w:r>
-        <w:t xml:space="preserve">      currentLines = [];</w:t>
-      </w:r>
-    </w:p>
-    <w:p>
-      <w:pPr>
-        <w:keepLines w:val="0"/>
-        <w:widowControl w:val="0"/>
-      </w:pPr>
-      <w:r>
-        <w:t xml:space="preserve">      currentLength = 0;</w:t>
-      </w:r>
-    </w:p>
-    <w:p>
-      <w:pPr>
-        <w:keepLines w:val="0"/>
-        <w:widowControl w:val="0"/>
-      </w:pPr>
-      <w:r>
-        <w:t xml:space="preserve">    }</w:t>
-      </w:r>
-    </w:p>
-    <w:p>
-      <w:pPr>
-        <w:keepLines w:val="0"/>
-        <w:widowControl w:val="0"/>
-      </w:pPr>
-      <w:r/>
-    </w:p>
-    <w:p>
-      <w:pPr>
-        <w:keepLines w:val="0"/>
-        <w:widowControl w:val="0"/>
-      </w:pPr>
-      <w:r>
-        <w:t xml:space="preserve">    // 今のHTMLでは最長行も上限より短いですが、将来の長い行にも対応します。</w:t>
-      </w:r>
-    </w:p>
-    <w:p>
-      <w:pPr>
-        <w:keepLines w:val="0"/>
-        <w:widowControl w:val="0"/>
-      </w:pPr>
-      <w:r>
-        <w:t xml:space="preserve">    while (piece.length &gt; maxChars) {</w:t>
-      </w:r>
-    </w:p>
-    <w:p>
-      <w:pPr>
-        <w:keepLines w:val="0"/>
-        <w:widowControl w:val="0"/>
-      </w:pPr>
-      <w:r>
-        <w:t xml:space="preserve">      var take = piece.slice(0, maxChars);</w:t>
-      </w:r>
-    </w:p>
-    <w:p>
-      <w:pPr>
-        <w:keepLines w:val="0"/>
-        <w:widowControl w:val="0"/>
-      </w:pPr>
-      <w:r>
-        <w:t xml:space="preserve">      currentLines.push(take);</w:t>
-      </w:r>
-    </w:p>
-    <w:p>
-      <w:pPr>
-        <w:keepLines w:val="0"/>
-        <w:widowControl w:val="0"/>
-      </w:pPr>
-      <w:r>
-        <w:t xml:space="preserve">      chunks.push(currentLines.join(""));</w:t>
-      </w:r>
-    </w:p>
-    <w:p>
-      <w:pPr>
-        <w:keepLines w:val="0"/>
-        <w:widowControl w:val="0"/>
-      </w:pPr>
-      <w:r>
-        <w:t xml:space="preserve">      currentLines = [];</w:t>
-      </w:r>
-    </w:p>
-    <w:p>
-      <w:pPr>
-        <w:keepLines w:val="0"/>
-        <w:widowControl w:val="0"/>
-      </w:pPr>
-      <w:r>
-        <w:t xml:space="preserve">      currentLength = 0;</w:t>
-      </w:r>
-    </w:p>
-    <w:p>
-      <w:pPr>
-        <w:keepLines w:val="0"/>
-        <w:widowControl w:val="0"/>
-      </w:pPr>
-      <w:r>
-        <w:t xml:space="preserve">      piece = piece.slice(maxChars);</w:t>
-      </w:r>
-    </w:p>
-    <w:p>
-      <w:pPr>
-        <w:keepLines w:val="0"/>
-        <w:widowControl w:val="0"/>
-      </w:pPr>
-      <w:r>
-        <w:t xml:space="preserve">    }</w:t>
-      </w:r>
-    </w:p>
-    <w:p>
-      <w:pPr>
-        <w:keepLines w:val="0"/>
-        <w:widowControl w:val="0"/>
-      </w:pPr>
-      <w:r/>
-    </w:p>
-    <w:p>
-      <w:pPr>
-        <w:keepLines w:val="0"/>
-        <w:widowControl w:val="0"/>
-      </w:pPr>
-      <w:r>
-        <w:t xml:space="preserve">    currentLines.push(piece);</w:t>
-      </w:r>
-    </w:p>
-    <w:p>
-      <w:pPr>
-        <w:keepLines w:val="0"/>
-        <w:widowControl w:val="0"/>
-      </w:pPr>
-      <w:r>
-        <w:t xml:space="preserve">    currentLength += piece.length;</w:t>
-      </w:r>
-    </w:p>
-    <w:p>
-      <w:pPr>
-        <w:keepLines w:val="0"/>
-        <w:widowControl w:val="0"/>
-      </w:pPr>
-      <w:r>
-        <w:t xml:space="preserve">  });</w:t>
-      </w:r>
-    </w:p>
-    <w:p>
-      <w:pPr>
-        <w:keepLines w:val="0"/>
-        <w:widowControl w:val="0"/>
-      </w:pPr>
-      <w:r/>
-    </w:p>
-    <w:p>
-      <w:pPr>
-        <w:keepLines w:val="0"/>
-        <w:widowControl w:val="0"/>
-      </w:pPr>
-      <w:r>
-        <w:t xml:space="preserve">  if (currentLines.length || !chunks.length) chunks.push(currentLines.join(""));</w:t>
-      </w:r>
-    </w:p>
-    <w:p>
-      <w:pPr>
-        <w:keepLines w:val="0"/>
-        <w:widowControl w:val="0"/>
-      </w:pPr>
-      <w:r>
-        <w:t xml:space="preserve">  return chunks;</w:t>
-      </w:r>
-    </w:p>
-    <w:p>
-      <w:pPr>
-        <w:keepLines w:val="0"/>
-        <w:widowControl w:val="0"/>
-      </w:pPr>
+      <w:pPr/>
       <w:r>
         <w:t>}</w:t>
       </w:r>
@@ -1366,11 +608,11 @@
     <w:qFormat/>
     <w:rsid w:val="00FC693F"/>
     <w:pPr>
-      <w:spacing w:before="0" w:after="0" w:line="240" w:lineRule="auto"/>
+      <w:spacing w:after="0"/>
     </w:pPr>
     <w:rPr>
       <w:rFonts w:ascii="Courier New" w:hAnsi="Courier New"/>
-      <w:sz w:val="16"/>
+      <w:sz w:val="18"/>
     </w:rPr>
   </w:style>
   <w:style w:type="paragraph" w:styleId="Header">

</xml_diff>

<commit_message>
Add phase-specific countdown animations and refresh GAS Word exports
</commit_message>
<xml_diff>
--- a/Code.docx
+++ b/Code.docx
@@ -3,245 +3,37 @@
 <w:document xmlns:wpc="http://schemas.microsoft.com/office/word/2010/wordprocessingCanvas" xmlns:mo="http://schemas.microsoft.com/office/mac/office/2008/main" xmlns:mc="http://schemas.openxmlformats.org/markup-compatibility/2006" xmlns:mv="urn:schemas-microsoft-com:mac:vml" xmlns:o="urn:schemas-microsoft-com:office:office" xmlns:r="http://schemas.openxmlformats.org/officeDocument/2006/relationships" xmlns:m="http://schemas.openxmlformats.org/officeDocument/2006/math" xmlns:v="urn:schemas-microsoft-com:vml" xmlns:wp14="http://schemas.microsoft.com/office/word/2010/wordprocessingDrawing" xmlns:wp="http://schemas.openxmlformats.org/drawingml/2006/wordprocessingDrawing" xmlns:w10="urn:schemas-microsoft-com:office:word" xmlns:w="http://schemas.openxmlformats.org/wordprocessingml/2006/main" xmlns:w14="http://schemas.microsoft.com/office/word/2010/wordml" xmlns:wpg="http://schemas.microsoft.com/office/word/2010/wordprocessingGroup" xmlns:wpi="http://schemas.microsoft.com/office/word/2010/wordprocessingInk" xmlns:wne="http://schemas.microsoft.com/office/word/2006/wordml" xmlns:wps="http://schemas.microsoft.com/office/word/2010/wordprocessingShape" mc:Ignorable="w14 wp14">
   <w:body>
     <w:p>
-      <w:pPr/>
+      <w:pPr>
+        <w:wordWrap w:val="0"/>
+      </w:pPr>
       <w:r>
-        <w:t>// Google Apps ScriptでゲームHTMLをDOCXに変換して、Google Driveへ保存します。</w:t>
-      </w:r>
-    </w:p>
-    <w:p>
-      <w:pPr/>
-      <w:r>
-        <w:t>function exportGameHtmlToDocx() {</w:t>
-      </w:r>
-    </w:p>
-    <w:p>
-      <w:pPr/>
-      <w:r>
-        <w:t xml:space="preserve">  var url = "https://raw.githubusercontent.com/jitianzheping19-del/suspect-space/main/space-suspect-complete.html";</w:t>
-      </w:r>
-    </w:p>
-    <w:p>
-      <w:pPr/>
-      <w:r>
-        <w:t xml:space="preserve">  var html = UrlFetchApp.fetch(url).getContentText("UTF-8");</w:t>
-      </w:r>
-    </w:p>
-    <w:p>
-      <w:pPr/>
-      <w:r>
-        <w:t xml:space="preserve">  var folder = DriveApp.createFolder("SPACE SUSPECT DOCX");</w:t>
-      </w:r>
-    </w:p>
-    <w:p>
-      <w:pPr/>
-      <w:r>
-        <w:t xml:space="preserve">  var parts = splitHtml_(html, 800000);</w:t>
-      </w:r>
-    </w:p>
-    <w:p>
-      <w:pPr/>
-    </w:p>
-    <w:p>
-      <w:pPr/>
-      <w:r>
-        <w:t xml:space="preserve">  parts.forEach(function (text, i) {</w:t>
-      </w:r>
-    </w:p>
-    <w:p>
-      <w:pPr/>
-      <w:r>
-        <w:t xml:space="preserve">    var doc = DocumentApp.create("SPACE SUSPECT HTML " + (i + 1));</w:t>
-      </w:r>
-    </w:p>
-    <w:p>
-      <w:pPr/>
-      <w:r>
-        <w:t xml:space="preserve">    var body = doc.getBody();</w:t>
-      </w:r>
-    </w:p>
-    <w:p>
-      <w:pPr/>
-      <w:r>
-        <w:t xml:space="preserve">    body.setText(text);</w:t>
-      </w:r>
-    </w:p>
-    <w:p>
-      <w:pPr/>
-      <w:r>
-        <w:t xml:space="preserve">    body.editAsText().setFontFamily("Courier New").setFontSize(7);</w:t>
-      </w:r>
-    </w:p>
-    <w:p>
-      <w:pPr/>
-      <w:r>
-        <w:t xml:space="preserve">    doc.saveAndClose();</w:t>
-      </w:r>
-    </w:p>
-    <w:p>
-      <w:pPr/>
-    </w:p>
-    <w:p>
-      <w:pPr/>
-      <w:r>
-        <w:t xml:space="preserve">    var name = "space-suspect-complete-" + (i + 1) + ".docx";</w:t>
-      </w:r>
-    </w:p>
-    <w:p>
-      <w:pPr/>
-      <w:r>
-        <w:t xml:space="preserve">    var blob = DriveApp.getFileById(doc.getId())</w:t>
-      </w:r>
-    </w:p>
-    <w:p>
-      <w:pPr/>
-      <w:r>
-        <w:t xml:space="preserve">      .getAs("application/vnd.openxmlformats-officedocument.wordprocessingml.document")</w:t>
-      </w:r>
-    </w:p>
-    <w:p>
-      <w:pPr/>
-      <w:r>
-        <w:t xml:space="preserve">      .setName(name);</w:t>
-      </w:r>
-    </w:p>
-    <w:p>
-      <w:pPr/>
-      <w:r>
-        <w:t xml:space="preserve">    folder.createFile(blob);</w:t>
-      </w:r>
-    </w:p>
-    <w:p>
-      <w:pPr/>
-      <w:r>
-        <w:t xml:space="preserve">    DriveApp.getFileById(doc.getId()).setTrashed(true);</w:t>
-      </w:r>
-    </w:p>
-    <w:p>
-      <w:pPr/>
-      <w:r>
-        <w:t xml:space="preserve">  });</w:t>
-      </w:r>
-    </w:p>
-    <w:p>
-      <w:pPr/>
-    </w:p>
-    <w:p>
-      <w:pPr/>
-      <w:r>
-        <w:t xml:space="preserve">  Logger.log("作成したDOCX: " + folder.getUrl());</w:t>
-      </w:r>
-    </w:p>
-    <w:p>
-      <w:pPr/>
-      <w:r>
+        <w:t>function doGet() {</w:t>
+        <w:br/>
+        <w:t xml:space="preserve">  return HtmlService.createHtmlOutputFromFile('index')</w:t>
+        <w:br/>
+        <w:t xml:space="preserve">    .setTitle('SPACE SUSPECT')</w:t>
+        <w:br/>
+        <w:t xml:space="preserve">    .setXFrameOptionsMode(HtmlService.XFrameOptionsMode.ALLOWALL);</w:t>
+        <w:br/>
         <w:t>}</w:t>
-      </w:r>
-    </w:p>
-    <w:p>
-      <w:pPr/>
-    </w:p>
-    <w:p>
-      <w:pPr/>
-      <w:r>
-        <w:t>function splitHtml_(text, limit) {</w:t>
-      </w:r>
-    </w:p>
-    <w:p>
-      <w:pPr/>
-      <w:r>
-        <w:t xml:space="preserve">  var parts = [];</w:t>
-      </w:r>
-    </w:p>
-    <w:p>
-      <w:pPr/>
-      <w:r>
-        <w:t xml:space="preserve">  while (text.length &gt; limit) {</w:t>
-      </w:r>
-    </w:p>
-    <w:p>
-      <w:pPr/>
-      <w:r>
-        <w:t xml:space="preserve">    var cut = text.lastIndexOf("\n", limit);</w:t>
-      </w:r>
-    </w:p>
-    <w:p>
-      <w:pPr/>
-      <w:r>
-        <w:t xml:space="preserve">    if (cut &lt; 1) cut = limit;</w:t>
-      </w:r>
-    </w:p>
-    <w:p>
-      <w:pPr/>
-      <w:r>
-        <w:t xml:space="preserve">    parts.push(text.slice(0, cut + 1));</w:t>
-      </w:r>
-    </w:p>
-    <w:p>
-      <w:pPr/>
-      <w:r>
-        <w:t xml:space="preserve">    text = text.slice(cut + 1);</w:t>
-      </w:r>
-    </w:p>
-    <w:p>
-      <w:pPr/>
-      <w:r>
-        <w:t xml:space="preserve">  }</w:t>
-      </w:r>
-    </w:p>
-    <w:p>
-      <w:pPr/>
-      <w:r>
-        <w:t xml:space="preserve">  parts.push(text);</w:t>
-      </w:r>
-    </w:p>
-    <w:p>
-      <w:pPr/>
-      <w:r>
-        <w:t xml:space="preserve">  return parts;</w:t>
-      </w:r>
-    </w:p>
-    <w:p>
-      <w:pPr/>
-      <w:r>
+        <w:br/>
+        <w:br/>
+        <w:t>function getUrl() {</w:t>
+        <w:br/>
+        <w:t xml:space="preserve">  return ScriptApp.getService().getUrl();</w:t>
+        <w:br/>
         <w:t>}</w:t>
+        <w:br/>
       </w:r>
     </w:p>
     <w:sectPr>
-      <w:headerReference w:type="default" r:id="rId9"/>
-      <w:footerReference w:type="default" r:id="rId10"/>
       <w:pgSz w:w="12240" w:h="15840"/>
-      <w:pgMar w:top="1440" w:right="1800" w:bottom="1440" w:left="1800" w:header="720" w:footer="720" w:gutter="0"/>
+      <w:pgMar w:top="792" w:right="792" w:bottom="792" w:left="792" w:header="720" w:footer="720" w:gutter="0"/>
       <w:cols w:space="720"/>
       <w:docGrid w:linePitch="360"/>
     </w:sectPr>
   </w:body>
 </w:document>
-</file>
-
-<file path=word/footer1.xml><?xml version="1.0" encoding="utf-8"?>
-<w:ftr xmlns:m="http://schemas.openxmlformats.org/officeDocument/2006/math" xmlns:mc="http://schemas.openxmlformats.org/markup-compatibility/2006" xmlns:mo="http://schemas.microsoft.com/office/mac/office/2008/main" xmlns:mv="urn:schemas-microsoft-com:mac:vml" xmlns:o="urn:schemas-microsoft-com:office:office" xmlns:r="http://schemas.openxmlformats.org/officeDocument/2006/relationships" xmlns:v="urn:schemas-microsoft-com:vml" xmlns:w10="urn:schemas-microsoft-com:office:word" xmlns:w14="http://schemas.microsoft.com/office/word/2010/wordml" xmlns:w="http://schemas.openxmlformats.org/wordprocessingml/2006/main" xmlns:wne="http://schemas.microsoft.com/office/word/2006/wordml" xmlns:wp14="http://schemas.microsoft.com/office/word/2010/wordprocessingDrawing" xmlns:wp="http://schemas.openxmlformats.org/drawingml/2006/wordprocessingDrawing" xmlns:wpc="http://schemas.microsoft.com/office/word/2010/wordprocessingCanvas" xmlns:wpg="http://schemas.microsoft.com/office/word/2010/wordprocessingGroup" xmlns:wpi="http://schemas.microsoft.com/office/word/2010/wordprocessingInk" xmlns:wps="http://schemas.microsoft.com/office/word/2010/wordprocessingShape" mc:Ignorable="w14 wp14">
-  <w:p>
-    <w:pPr>
-      <w:pStyle w:val="Footer"/>
-    </w:pPr>
-    <w:r>
-      <w:t>Code.gs</w:t>
-    </w:r>
-  </w:p>
-</w:ftr>
-</file>
-
-<file path=word/header1.xml><?xml version="1.0" encoding="utf-8"?>
-<w:hdr xmlns:m="http://schemas.openxmlformats.org/officeDocument/2006/math" xmlns:mc="http://schemas.openxmlformats.org/markup-compatibility/2006" xmlns:mo="http://schemas.microsoft.com/office/mac/office/2008/main" xmlns:mv="urn:schemas-microsoft-com:mac:vml" xmlns:o="urn:schemas-microsoft-com:office:office" xmlns:r="http://schemas.openxmlformats.org/officeDocument/2006/relationships" xmlns:v="urn:schemas-microsoft-com:vml" xmlns:w10="urn:schemas-microsoft-com:office:word" xmlns:w14="http://schemas.microsoft.com/office/word/2010/wordml" xmlns:w="http://schemas.openxmlformats.org/wordprocessingml/2006/main" xmlns:wne="http://schemas.microsoft.com/office/word/2006/wordml" xmlns:wp14="http://schemas.microsoft.com/office/word/2010/wordprocessingDrawing" xmlns:wp="http://schemas.openxmlformats.org/drawingml/2006/wordprocessingDrawing" xmlns:wpc="http://schemas.microsoft.com/office/word/2010/wordprocessingCanvas" xmlns:wpg="http://schemas.microsoft.com/office/word/2010/wordprocessingGroup" xmlns:wpi="http://schemas.microsoft.com/office/word/2010/wordprocessingInk" xmlns:wps="http://schemas.microsoft.com/office/word/2010/wordprocessingShape" mc:Ignorable="w14 wp14">
-  <w:p>
-    <w:pPr>
-      <w:pStyle w:val="Header"/>
-    </w:pPr>
-    <w:r>
-      <w:t>SPACE SUSPECT ｜ Google Apps Script</w:t>
-    </w:r>
-  </w:p>
-</w:hdr>
 </file>
 
 <file path=word/numbering.xml><?xml version="1.0" encoding="utf-8"?>
@@ -608,11 +400,11 @@
     <w:qFormat/>
     <w:rsid w:val="00FC693F"/>
     <w:pPr>
-      <w:spacing w:after="0"/>
+      <w:spacing w:after="0" w:line="240" w:lineRule="auto"/>
     </w:pPr>
     <w:rPr>
-      <w:rFonts w:ascii="Courier New" w:hAnsi="Courier New"/>
-      <w:sz w:val="18"/>
+      <w:rFonts w:ascii="Consolas" w:hAnsi="Consolas"/>
+      <w:sz w:val="16"/>
     </w:rPr>
   </w:style>
   <w:style w:type="paragraph" w:styleId="Header">

</xml_diff>